<commit_message>
docs: варианты сборки — debug, release, releaseDebuggable
</commit_message>
<xml_diff>
--- a/docs/FinGame-Документация.docx
+++ b/docs/FinGame-Документация.docx
@@ -2367,7 +2367,106 @@
         <w:pStyle w:val="FirstParagraph"/>
       </w:pPr>
       <w:r>
-        <w:t xml:space="preserve">Флейворов (productFlavors) в проекте нет. Есть два типа сборки:</w:t>
+        <w:t xml:space="preserve">Флейворов (productFlavors) в проекте нет. В</w:t>
+      </w:r>
+      <w:r>
+        <w:t xml:space="preserve"> </w:t>
+      </w:r>
+      <w:r>
+        <w:rPr>
+          <w:rStyle w:val="VerbatimChar"/>
+        </w:rPr>
+        <w:t xml:space="preserve">app/build.gradle.kts</w:t>
+      </w:r>
+      <w:r>
+        <w:t xml:space="preserve"> </w:t>
+      </w:r>
+      <w:r>
+        <w:t xml:space="preserve">объявлены три типа сборки:</w:t>
+      </w:r>
+      <w:r>
+        <w:t xml:space="preserve"> </w:t>
+      </w:r>
+      <w:r>
+        <w:rPr>
+          <w:rStyle w:val="VerbatimChar"/>
+        </w:rPr>
+        <w:t xml:space="preserve">debug</w:t>
+      </w:r>
+      <w:r>
+        <w:t xml:space="preserve"> </w:t>
+      </w:r>
+      <w:r>
+        <w:t xml:space="preserve">и</w:t>
+      </w:r>
+      <w:r>
+        <w:t xml:space="preserve"> </w:t>
+      </w:r>
+      <w:r>
+        <w:rPr>
+          <w:rStyle w:val="VerbatimChar"/>
+        </w:rPr>
+        <w:t xml:space="preserve">release</w:t>
+      </w:r>
+      <w:r>
+        <w:t xml:space="preserve"> </w:t>
+      </w:r>
+      <w:r>
+        <w:t xml:space="preserve">— обычные типы AGP,</w:t>
+      </w:r>
+      <w:r>
+        <w:t xml:space="preserve"> </w:t>
+      </w:r>
+      <w:r>
+        <w:rPr>
+          <w:rStyle w:val="VerbatimChar"/>
+        </w:rPr>
+        <w:t xml:space="preserve">releaseDebuggable</w:t>
+      </w:r>
+      <w:r>
+        <w:t xml:space="preserve"> </w:t>
+      </w:r>
+      <w:r>
+        <w:t xml:space="preserve">— третий, добавленный отдельно</w:t>
+      </w:r>
+      <w:r>
+        <w:t xml:space="preserve"> </w:t>
+      </w:r>
+      <w:r>
+        <w:t xml:space="preserve">(</w:t>
+      </w:r>
+      <w:r>
+        <w:rPr>
+          <w:rStyle w:val="VerbatimChar"/>
+        </w:rPr>
+        <w:t xml:space="preserve">create("releaseDebuggable") { initWith(getByName("release")); isDebuggable = true; signingConfig = signingConfigs.getByName("debug") }</w:t>
+      </w:r>
+      <w:r>
+        <w:t xml:space="preserve">) специально для тестирования на устройстве</w:t>
+      </w:r>
+      <w:r>
+        <w:t xml:space="preserve"> </w:t>
+      </w:r>
+      <w:r>
+        <w:t xml:space="preserve">поведения release-сборки (минификация,</w:t>
+      </w:r>
+      <w:r>
+        <w:t xml:space="preserve"> </w:t>
+      </w:r>
+      <w:r>
+        <w:rPr>
+          <w:rStyle w:val="VerbatimChar"/>
+        </w:rPr>
+        <w:t xml:space="preserve">DEMO_MODE</w:t>
+      </w:r>
+      <w:r>
+        <w:t xml:space="preserve">) с возможностью подключить отладчик/логи и без</w:t>
+      </w:r>
+      <w:r>
+        <w:t xml:space="preserve"> </w:t>
+      </w:r>
+      <w:r>
+        <w:t xml:space="preserve">переустановки поверх debug.</w:t>
       </w:r>
     </w:p>
     <w:tbl>
@@ -2377,9 +2476,10 @@
         <w:tblLook w:firstRow="1" w:lastRow="0" w:firstColumn="0" w:lastColumn="0" w:noHBand="0" w:noVBand="0" w:val="0020"/>
       </w:tblPr>
       <w:tblGrid>
-        <w:gridCol w:w="2640"/>
-        <w:gridCol w:w="2640"/>
-        <w:gridCol w:w="2640"/>
+        <w:gridCol w:w="1980"/>
+        <w:gridCol w:w="1980"/>
+        <w:gridCol w:w="1980"/>
+        <w:gridCol w:w="1980"/>
       </w:tblGrid>
       <w:tr>
         <w:trPr>
@@ -2418,6 +2518,93 @@
             </w:r>
           </w:p>
         </w:tc>
+        <w:tc>
+          <w:tcPr/>
+          <w:p>
+            <w:pPr>
+              <w:pStyle w:val="Compact"/>
+            </w:pPr>
+            <w:r>
+              <w:t xml:space="preserve">releaseDebuggable</w:t>
+            </w:r>
+          </w:p>
+        </w:tc>
+      </w:tr>
+      <w:tr>
+        <w:tc>
+          <w:tcPr/>
+          <w:p>
+            <w:pPr>
+              <w:pStyle w:val="Compact"/>
+            </w:pPr>
+            <w:r>
+              <w:rPr>
+                <w:rStyle w:val="VerbatimChar"/>
+              </w:rPr>
+              <w:t xml:space="preserve">isDebuggable</w:t>
+            </w:r>
+          </w:p>
+        </w:tc>
+        <w:tc>
+          <w:tcPr/>
+          <w:p>
+            <w:pPr>
+              <w:pStyle w:val="Compact"/>
+            </w:pPr>
+            <w:r>
+              <w:rPr>
+                <w:rStyle w:val="VerbatimChar"/>
+              </w:rPr>
+              <w:t xml:space="preserve">true</w:t>
+            </w:r>
+          </w:p>
+        </w:tc>
+        <w:tc>
+          <w:tcPr/>
+          <w:p>
+            <w:pPr>
+              <w:pStyle w:val="Compact"/>
+            </w:pPr>
+            <w:r>
+              <w:rPr>
+                <w:rStyle w:val="VerbatimChar"/>
+              </w:rPr>
+              <w:t xml:space="preserve">false</w:t>
+            </w:r>
+          </w:p>
+        </w:tc>
+        <w:tc>
+          <w:tcPr/>
+          <w:p>
+            <w:pPr>
+              <w:pStyle w:val="Compact"/>
+            </w:pPr>
+            <w:r>
+              <w:rPr>
+                <w:rStyle w:val="VerbatimChar"/>
+              </w:rPr>
+              <w:t xml:space="preserve">true</w:t>
+            </w:r>
+            <w:r>
+              <w:t xml:space="preserve"> </w:t>
+            </w:r>
+            <w:r>
+              <w:t xml:space="preserve">(</w:t>
+            </w:r>
+            <w:r>
+              <w:rPr>
+                <w:rStyle w:val="VerbatimChar"/>
+              </w:rPr>
+              <w:t xml:space="preserve">initWith(release)</w:t>
+            </w:r>
+            <w:r>
+              <w:t xml:space="preserve"> </w:t>
+            </w:r>
+            <w:r>
+              <w:t xml:space="preserve">+ переопределение)</w:t>
+            </w:r>
+          </w:p>
+        </w:tc>
       </w:tr>
       <w:tr>
         <w:tc>
@@ -2462,16 +2649,39 @@
             </w:r>
           </w:p>
         </w:tc>
-      </w:tr>
-      <w:tr>
-        <w:tc>
-          <w:tcPr/>
-          <w:p>
-            <w:pPr>
-              <w:pStyle w:val="Compact"/>
-            </w:pPr>
-            <w:r>
-              <w:t xml:space="preserve">Кнопка «Вперёд на 12 часов»</w:t>
+        <w:tc>
+          <w:tcPr/>
+          <w:p>
+            <w:pPr>
+              <w:pStyle w:val="Compact"/>
+            </w:pPr>
+            <w:r>
+              <w:rPr>
+                <w:rStyle w:val="VerbatimChar"/>
+              </w:rPr>
+              <w:t xml:space="preserve">false</w:t>
+            </w:r>
+          </w:p>
+        </w:tc>
+      </w:tr>
+      <w:tr>
+        <w:tc>
+          <w:tcPr/>
+          <w:p>
+            <w:pPr>
+              <w:pStyle w:val="Compact"/>
+            </w:pPr>
+            <w:r>
+              <w:t xml:space="preserve">Кнопка «Вперёд на 12 часов» (</w:t>
+            </w:r>
+            <w:r>
+              <w:rPr>
+                <w:rStyle w:val="VerbatimChar"/>
+              </w:rPr>
+              <w:t xml:space="preserve">DemoMode.ENABLED</w:t>
+            </w:r>
+            <w:r>
+              <w:t xml:space="preserve">)</w:t>
             </w:r>
           </w:p>
         </w:tc>
@@ -2497,6 +2707,29 @@
             </w:r>
           </w:p>
         </w:tc>
+        <w:tc>
+          <w:tcPr/>
+          <w:p>
+            <w:pPr>
+              <w:pStyle w:val="Compact"/>
+            </w:pPr>
+            <w:r>
+              <w:t xml:space="preserve">нет (пока не переопределено</w:t>
+            </w:r>
+            <w:r>
+              <w:t xml:space="preserve"> </w:t>
+            </w:r>
+            <w:r>
+              <w:rPr>
+                <w:rStyle w:val="VerbatimChar"/>
+              </w:rPr>
+              <w:t xml:space="preserve">-Pfingame.demoMode=true</w:t>
+            </w:r>
+            <w:r>
+              <w:t xml:space="preserve">)</w:t>
+            </w:r>
+          </w:p>
+        </w:tc>
       </w:tr>
       <w:tr>
         <w:tc>
@@ -2541,6 +2774,29 @@
             </w:r>
           </w:p>
         </w:tc>
+        <w:tc>
+          <w:tcPr/>
+          <w:p>
+            <w:pPr>
+              <w:pStyle w:val="Compact"/>
+            </w:pPr>
+            <w:r>
+              <w:t xml:space="preserve">отключена (наследуется от</w:t>
+            </w:r>
+            <w:r>
+              <w:t xml:space="preserve"> </w:t>
+            </w:r>
+            <w:r>
+              <w:rPr>
+                <w:rStyle w:val="VerbatimChar"/>
+              </w:rPr>
+              <w:t xml:space="preserve">release</w:t>
+            </w:r>
+            <w:r>
+              <w:t xml:space="preserve">)</w:t>
+            </w:r>
+          </w:p>
+        </w:tc>
       </w:tr>
       <w:tr>
         <w:tc>
@@ -2561,7 +2817,19 @@
               <w:pStyle w:val="Compact"/>
             </w:pPr>
             <w:r>
-              <w:t xml:space="preserve">отладочный ключ Android SDK</w:t>
+              <w:t xml:space="preserve">отладочный ключ Android SDK (</w:t>
+            </w:r>
+            <w:r>
+              <w:rPr>
+                <w:rStyle w:val="VerbatimChar"/>
+              </w:rPr>
+              <w:t xml:space="preserve">signingConfig</w:t>
+            </w:r>
+            <w:r>
+              <w:t xml:space="preserve"> </w:t>
+            </w:r>
+            <w:r>
+              <w:t xml:space="preserve">по умолчанию)</w:t>
             </w:r>
           </w:p>
         </w:tc>
@@ -2584,7 +2852,27 @@
               <w:t xml:space="preserve"> </w:t>
             </w:r>
             <w:r>
-              <w:t xml:space="preserve">отсутствует), APK подписывается вручную</w:t>
+              <w:t xml:space="preserve">отсутствует), APK неподписанный</w:t>
+            </w:r>
+          </w:p>
+        </w:tc>
+        <w:tc>
+          <w:tcPr/>
+          <w:p>
+            <w:pPr>
+              <w:pStyle w:val="Compact"/>
+            </w:pPr>
+            <w:r>
+              <w:t xml:space="preserve">отладочный ключ Android SDK (</w:t>
+            </w:r>
+            <w:r>
+              <w:rPr>
+                <w:rStyle w:val="VerbatimChar"/>
+              </w:rPr>
+              <w:t xml:space="preserve">signingConfig = signingConfigs.getByName("debug")</w:t>
+            </w:r>
+            <w:r>
+              <w:t xml:space="preserve">, задан явно)</w:t>
             </w:r>
           </w:p>
         </w:tc>
@@ -2626,6 +2914,75 @@
                 <w:rStyle w:val="VerbatimChar"/>
               </w:rPr>
               <w:t xml:space="preserve">app/build/outputs/apk/release/app-release-unsigned.apk</w:t>
+            </w:r>
+          </w:p>
+        </w:tc>
+        <w:tc>
+          <w:tcPr/>
+          <w:p>
+            <w:pPr>
+              <w:pStyle w:val="Compact"/>
+            </w:pPr>
+            <w:r>
+              <w:rPr>
+                <w:rStyle w:val="VerbatimChar"/>
+              </w:rPr>
+              <w:t xml:space="preserve">app/build/outputs/apk/releaseDebuggable/app-releaseDebuggable.apk</w:t>
+            </w:r>
+          </w:p>
+        </w:tc>
+      </w:tr>
+      <w:tr>
+        <w:tc>
+          <w:tcPr/>
+          <w:p>
+            <w:pPr>
+              <w:pStyle w:val="Compact"/>
+            </w:pPr>
+            <w:r>
+              <w:t xml:space="preserve">Команда</w:t>
+            </w:r>
+          </w:p>
+        </w:tc>
+        <w:tc>
+          <w:tcPr/>
+          <w:p>
+            <w:pPr>
+              <w:pStyle w:val="Compact"/>
+            </w:pPr>
+            <w:r>
+              <w:rPr>
+                <w:rStyle w:val="VerbatimChar"/>
+              </w:rPr>
+              <w:t xml:space="preserve">./gradlew :app:assembleDebug</w:t>
+            </w:r>
+          </w:p>
+        </w:tc>
+        <w:tc>
+          <w:tcPr/>
+          <w:p>
+            <w:pPr>
+              <w:pStyle w:val="Compact"/>
+            </w:pPr>
+            <w:r>
+              <w:rPr>
+                <w:rStyle w:val="VerbatimChar"/>
+              </w:rPr>
+              <w:t xml:space="preserve">./gradlew :app:assembleRelease</w:t>
+            </w:r>
+          </w:p>
+        </w:tc>
+        <w:tc>
+          <w:tcPr/>
+          <w:p>
+            <w:pPr>
+              <w:pStyle w:val="Compact"/>
+            </w:pPr>
+            <w:r>
+              <w:rPr>
+                <w:rStyle w:val="VerbatimChar"/>
+              </w:rPr>
+              <w:t xml:space="preserve">./gradlew :app:assembleReleaseDebuggable</w:t>
             </w:r>
           </w:p>
         </w:tc>
@@ -2636,7 +2993,94 @@
         <w:pStyle w:val="BodyText"/>
       </w:pPr>
       <w:r>
-        <w:t xml:space="preserve">Демо-режим можно переопределить для любого типа сборки без правки файлов:</w:t>
+        <w:rPr>
+          <w:rStyle w:val="VerbatimChar"/>
+        </w:rPr>
+        <w:t xml:space="preserve">BuildConfig.DEMO_MODE</w:t>
+      </w:r>
+      <w:r>
+        <w:t xml:space="preserve"> </w:t>
+      </w:r>
+      <w:r>
+        <w:t xml:space="preserve">в каждом типе берётся из</w:t>
+      </w:r>
+      <w:r>
+        <w:t xml:space="preserve"> </w:t>
+      </w:r>
+      <w:r>
+        <w:rPr>
+          <w:rStyle w:val="VerbatimChar"/>
+        </w:rPr>
+        <w:t xml:space="preserve">demoModeOverride</w:t>
+      </w:r>
+      <w:r>
+        <w:t xml:space="preserve"> </w:t>
+      </w:r>
+      <w:r>
+        <w:t xml:space="preserve">— значения gradle-свойства</w:t>
+      </w:r>
+      <w:r>
+        <w:t xml:space="preserve"> </w:t>
+      </w:r>
+      <w:r>
+        <w:rPr>
+          <w:rStyle w:val="VerbatimChar"/>
+        </w:rPr>
+        <w:t xml:space="preserve">fingame.demoMode</w:t>
+      </w:r>
+      <w:r>
+        <w:t xml:space="preserve"> </w:t>
+      </w:r>
+      <w:r>
+        <w:t xml:space="preserve">(</w:t>
+      </w:r>
+      <w:r>
+        <w:rPr>
+          <w:rStyle w:val="VerbatimChar"/>
+        </w:rPr>
+        <w:t xml:space="preserve">providers.gradleProperty("fingame.demoMode")</w:t>
+      </w:r>
+      <w:r>
+        <w:t xml:space="preserve">), если оно задано, иначе из</w:t>
+      </w:r>
+      <w:r>
+        <w:t xml:space="preserve"> </w:t>
+      </w:r>
+      <w:r>
+        <w:t xml:space="preserve">значения по умолчанию для этого типа сборки (</w:t>
+      </w:r>
+      <w:r>
+        <w:rPr>
+          <w:rStyle w:val="VerbatimChar"/>
+        </w:rPr>
+        <w:t xml:space="preserve">true</w:t>
+      </w:r>
+      <w:r>
+        <w:t xml:space="preserve"> </w:t>
+      </w:r>
+      <w:r>
+        <w:t xml:space="preserve">для debug,</w:t>
+      </w:r>
+      <w:r>
+        <w:t xml:space="preserve"> </w:t>
+      </w:r>
+      <w:r>
+        <w:rPr>
+          <w:rStyle w:val="VerbatimChar"/>
+        </w:rPr>
+        <w:t xml:space="preserve">false</w:t>
+      </w:r>
+      <w:r>
+        <w:t xml:space="preserve"> </w:t>
+      </w:r>
+      <w:r>
+        <w:t xml:space="preserve">для release и</w:t>
+      </w:r>
+      <w:r>
+        <w:t xml:space="preserve"> </w:t>
+      </w:r>
+      <w:r>
+        <w:t xml:space="preserve">releaseDebuggable). Свойство переопределяет демо-режим для любого типа без правки файлов:</w:t>
       </w:r>
       <w:r>
         <w:t xml:space="preserve"> </w:t>
@@ -2657,7 +3101,307 @@
         <w:t xml:space="preserve"> </w:t>
       </w:r>
       <w:r>
-        <w:t xml:space="preserve">времени (удобно для показа жюри).</w:t>
+        <w:t xml:space="preserve">времени (удобно для показа жюри),</w:t>
+      </w:r>
+      <w:r>
+        <w:t xml:space="preserve"> </w:t>
+      </w:r>
+      <w:r>
+        <w:rPr>
+          <w:rStyle w:val="VerbatimChar"/>
+        </w:rPr>
+        <w:t xml:space="preserve">./gradlew :app:assembleDebug -Pfingame.demoMode=false</w:t>
+      </w:r>
+      <w:r>
+        <w:t xml:space="preserve"> </w:t>
+      </w:r>
+      <w:r>
+        <w:t xml:space="preserve">—</w:t>
+      </w:r>
+      <w:r>
+        <w:t xml:space="preserve"> </w:t>
+      </w:r>
+      <w:r>
+        <w:t xml:space="preserve">отладочная сборка без демо-кнопки.</w:t>
+      </w:r>
+    </w:p>
+    <w:p>
+      <w:pPr>
+        <w:pStyle w:val="BodyText"/>
+      </w:pPr>
+      <w:r>
+        <w:rPr>
+          <w:rStyle w:val="VerbatimChar"/>
+        </w:rPr>
+        <w:t xml:space="preserve">app-release-unsigned.apk</w:t>
+      </w:r>
+      <w:r>
+        <w:t xml:space="preserve"> </w:t>
+      </w:r>
+      <w:r>
+        <w:t xml:space="preserve">не устанавливается через</w:t>
+      </w:r>
+      <w:r>
+        <w:t xml:space="preserve"> </w:t>
+      </w:r>
+      <w:r>
+        <w:rPr>
+          <w:rStyle w:val="VerbatimChar"/>
+        </w:rPr>
+        <w:t xml:space="preserve">adb install</w:t>
+      </w:r>
+      <w:r>
+        <w:t xml:space="preserve"> </w:t>
+      </w:r>
+      <w:r>
+        <w:t xml:space="preserve">без подписи (см. шаг 2.3);</w:t>
+      </w:r>
+      <w:r>
+        <w:t xml:space="preserve"> </w:t>
+      </w:r>
+      <w:r>
+        <w:rPr>
+          <w:rStyle w:val="VerbatimChar"/>
+        </w:rPr>
+        <w:t xml:space="preserve">app-debug.apk</w:t>
+      </w:r>
+      <w:r>
+        <w:t xml:space="preserve"> </w:t>
+      </w:r>
+      <w:r>
+        <w:t xml:space="preserve">и</w:t>
+      </w:r>
+      <w:r>
+        <w:t xml:space="preserve"> </w:t>
+      </w:r>
+      <w:r>
+        <w:rPr>
+          <w:rStyle w:val="VerbatimChar"/>
+        </w:rPr>
+        <w:t xml:space="preserve">app-releaseDebuggable.apk</w:t>
+      </w:r>
+      <w:r>
+        <w:t xml:space="preserve"> </w:t>
+      </w:r>
+      <w:r>
+        <w:t xml:space="preserve">подписаны отладочным ключом и ставятся сразу — но</w:t>
+      </w:r>
+      <w:r>
+        <w:t xml:space="preserve"> </w:t>
+      </w:r>
+      <w:r>
+        <w:t xml:space="preserve">между собой они несовместимы с</w:t>
+      </w:r>
+      <w:r>
+        <w:t xml:space="preserve"> </w:t>
+      </w:r>
+      <w:r>
+        <w:rPr>
+          <w:rStyle w:val="VerbatimChar"/>
+        </w:rPr>
+        <w:t xml:space="preserve">app-release-*.apk</w:t>
+      </w:r>
+      <w:r>
+        <w:t xml:space="preserve">, подписанным релизным ключом (Android не даст</w:t>
+      </w:r>
+      <w:r>
+        <w:t xml:space="preserve"> </w:t>
+      </w:r>
+      <w:r>
+        <w:t xml:space="preserve">обновить одну сборку другой при разных подписях, только переустановку, см. предупреждение в 2.3).</w:t>
+      </w:r>
+    </w:p>
+    <w:p>
+      <w:pPr>
+        <w:pStyle w:val="BodyText"/>
+      </w:pPr>
+      <w:r>
+        <w:rPr>
+          <w:b/>
+          <w:bCs/>
+        </w:rPr>
+        <w:t xml:space="preserve">[TODO ревьюер: в системе квестов (ветка</w:t>
+      </w:r>
+      <w:r>
+        <w:rPr>
+          <w:b/>
+          <w:bCs/>
+        </w:rPr>
+        <w:t xml:space="preserve"> </w:t>
+      </w:r>
+      <w:r>
+        <w:rPr>
+          <w:rStyle w:val="VerbatimChar"/>
+          <w:b/>
+          <w:bCs/>
+        </w:rPr>
+        <w:t xml:space="preserve">stef-quests</w:t>
+      </w:r>
+      <w:r>
+        <w:rPr>
+          <w:b/>
+          <w:bCs/>
+        </w:rPr>
+        <w:t xml:space="preserve">, ещё не слита в</w:t>
+      </w:r>
+      <w:r>
+        <w:rPr>
+          <w:b/>
+          <w:bCs/>
+        </w:rPr>
+        <w:t xml:space="preserve"> </w:t>
+      </w:r>
+      <w:r>
+        <w:rPr>
+          <w:rStyle w:val="VerbatimChar"/>
+          <w:b/>
+          <w:bCs/>
+        </w:rPr>
+        <w:t xml:space="preserve">main</w:t>
+      </w:r>
+      <w:r>
+        <w:rPr>
+          <w:b/>
+          <w:bCs/>
+        </w:rPr>
+        <w:t xml:space="preserve">) вводится правило —</w:t>
+      </w:r>
+      <w:r>
+        <w:rPr>
+          <w:b/>
+          <w:bCs/>
+        </w:rPr>
+        <w:t xml:space="preserve"> </w:t>
+      </w:r>
+      <w:r>
+        <w:rPr>
+          <w:b/>
+          <w:bCs/>
+        </w:rPr>
+        <w:t xml:space="preserve">в отладочных сборках (</w:t>
+      </w:r>
+      <w:r>
+        <w:rPr>
+          <w:rStyle w:val="VerbatimChar"/>
+          <w:b/>
+          <w:bCs/>
+        </w:rPr>
+        <w:t xml:space="preserve">BuildConfig.DEBUG == true</w:t>
+      </w:r>
+      <w:r>
+        <w:rPr>
+          <w:b/>
+          <w:bCs/>
+        </w:rPr>
+        <w:t xml:space="preserve">, т.е. debug и releaseDebuggable) кулдауны между</w:t>
+      </w:r>
+      <w:r>
+        <w:rPr>
+          <w:b/>
+          <w:bCs/>
+        </w:rPr>
+        <w:t xml:space="preserve"> </w:t>
+      </w:r>
+      <w:r>
+        <w:rPr>
+          <w:b/>
+          <w:bCs/>
+        </w:rPr>
+        <w:t xml:space="preserve">квестами и паузы между их этапами отключены, чтобы квесты можно было проверять без ожидания; в</w:t>
+      </w:r>
+      <w:r>
+        <w:rPr>
+          <w:b/>
+          <w:bCs/>
+        </w:rPr>
+        <w:t xml:space="preserve"> </w:t>
+      </w:r>
+      <w:r>
+        <w:rPr>
+          <w:b/>
+          <w:bCs/>
+        </w:rPr>
+        <w:t xml:space="preserve">release эти кулдауны и паузы действуют как задумано для игрока. В смёрженном на 28.09.2026</w:t>
+      </w:r>
+      <w:r>
+        <w:rPr>
+          <w:b/>
+          <w:bCs/>
+        </w:rPr>
+        <w:t xml:space="preserve"> </w:t>
+      </w:r>
+      <w:r>
+        <w:rPr>
+          <w:rStyle w:val="VerbatimChar"/>
+          <w:b/>
+          <w:bCs/>
+        </w:rPr>
+        <w:t xml:space="preserve">main</w:t>
+      </w:r>
+      <w:r>
+        <w:rPr>
+          <w:b/>
+          <w:bCs/>
+        </w:rPr>
+        <w:t xml:space="preserve"> </w:t>
+      </w:r>
+      <w:r>
+        <w:rPr>
+          <w:b/>
+          <w:bCs/>
+        </w:rPr>
+        <w:t xml:space="preserve">использований</w:t>
+      </w:r>
+      <w:r>
+        <w:rPr>
+          <w:b/>
+          <w:bCs/>
+        </w:rPr>
+        <w:t xml:space="preserve"> </w:t>
+      </w:r>
+      <w:r>
+        <w:rPr>
+          <w:rStyle w:val="VerbatimChar"/>
+          <w:b/>
+          <w:bCs/>
+        </w:rPr>
+        <w:t xml:space="preserve">BuildConfig.DEBUG</w:t>
+      </w:r>
+      <w:r>
+        <w:rPr>
+          <w:b/>
+          <w:bCs/>
+        </w:rPr>
+        <w:t xml:space="preserve"> </w:t>
+      </w:r>
+      <w:r>
+        <w:rPr>
+          <w:b/>
+          <w:bCs/>
+        </w:rPr>
+        <w:t xml:space="preserve">ещё нет — уточнить формулировку и место действия после слияния</w:t>
+      </w:r>
+      <w:r>
+        <w:rPr>
+          <w:b/>
+          <w:bCs/>
+        </w:rPr>
+        <w:t xml:space="preserve"> </w:t>
+      </w:r>
+      <w:r>
+        <w:rPr>
+          <w:rStyle w:val="VerbatimChar"/>
+          <w:b/>
+          <w:bCs/>
+        </w:rPr>
+        <w:t xml:space="preserve">stef-quests</w:t>
+      </w:r>
+      <w:r>
+        <w:rPr>
+          <w:b/>
+          <w:bCs/>
+        </w:rPr>
+        <w:t xml:space="preserve">.]</w:t>
       </w:r>
     </w:p>
     <w:bookmarkEnd w:id="14"/>

</xml_diff>